<commit_message>
Auto-save: contexto al 90%
Guardado automático antes de compact.
Branch: main
Timestamp: 2026-10-02 08:23:53

Generated with Claude Code
</commit_message>
<xml_diff>
--- a/materiales/20_comparativa_herramientas.docx
+++ b/materiales/20_comparativa_herramientas.docx
@@ -66,10 +66,38 @@
         <w:rPr>
           <w:b/>
         </w:rPr>
+        <w:t xml:space="preserve">Gemini 3.1 Pro. </w:t>
+      </w:r>
+      <w:r>
+        <w:t>La línea de más capacidad: inteligencia avanzada, resolución de problemas complejos y trabajo agéntico. Está en vista previa, no en estable.</w:t>
+      </w:r>
+    </w:p>
+    <w:p>
+      <w:pPr>
+        <w:pStyle w:val="ListBullet"/>
+      </w:pPr>
+      <w:r>
+        <w:rPr>
+          <w:b/>
+        </w:rPr>
         <w:t xml:space="preserve">Gemini 3.8 Flash. </w:t>
       </w:r>
       <w:r>
-        <w:t>El de uso general. Admite texto, imágenes, vídeo y audio. Hace llamadas a funciones, devuelve salidas estructuradas y ejecuta código.</w:t>
+        <w:t>El estable de uso general, y el más capaz de la línea Flash. Admite texto, imágenes, vídeo y audio. Hace llamadas a funciones, devuelve salidas estructuradas y ejecuta código.</w:t>
+      </w:r>
+    </w:p>
+    <w:p>
+      <w:pPr>
+        <w:pStyle w:val="ListBullet"/>
+      </w:pPr>
+      <w:r>
+        <w:rPr>
+          <w:b/>
+        </w:rPr>
+        <w:t xml:space="preserve">Gemini 2.5 Pro. </w:t>
+      </w:r>
+      <w:r>
+        <w:t>El Pro estable de la generación anterior, para tareas complejas con razonamiento profundo.</w:t>
       </w:r>
     </w:p>
     <w:p>
@@ -613,6 +641,14 @@
         <w:pStyle w:val="ListBullet"/>
       </w:pPr>
       <w:r>
+        <w:t>Google reparte la familia en muchas líneas —Pro, Flash, Flash-Lite— y la de más capacidad estaba en vista previa el día de la consulta. Comparar «el modelo principal» de las tres casas no es una comparación entre iguales.</w:t>
+      </w:r>
+    </w:p>
+    <w:p>
+      <w:pPr>
+        <w:pStyle w:val="ListBullet"/>
+      </w:pPr>
+      <w:r>
         <w:t>Los precios de las aplicaciones de chat para empresa cambian por región y por plan: confírmalos en la página oficial de cada proveedor antes de contratar.</w:t>
       </w:r>
     </w:p>

</xml_diff>